<commit_message>
08_Insecure_Deserialization.docx: 서명 검증 1~5단계 표를 PDF 원문 수준으로 상세화
- 2단계: raw 바이트 접두부(ac ed 00 05...) 명시
- 4단계: expected/signature 바이트를 분리 표기하고 일치/불일치 색상(녹/적) 적용
- 5단계: 결과 표에도 동일한 색상 구분 적용
</commit_message>
<xml_diff>
--- a/docs/security/08_Insecure_Deserialization.docx
+++ b/docs/security/08_Insecure_Deserialization.docx
@@ -7133,7 +7133,7 @@
                 <w:sz w:val="18"/>
                 <w:szCs w:val="18"/>
               </w:rPr>
-              <w:t xml:space="preserve">raw 끝 4바이트: 00 00 00 32 (0x32 = 50%)</w:t>
+              <w:t xml:space="preserve">raw: ac ed 00 05 … 00 00 00 32 … → 0x32 = 50%</w:t>
             </w:r>
           </w:p>
         </w:tc>
@@ -7153,7 +7153,7 @@
                 <w:sz w:val="18"/>
                 <w:szCs w:val="18"/>
               </w:rPr>
-              <w:t xml:space="preserve">raw 끝 4바이트: 00 00 00 64 (0x64 = 100%, 변조됨)</w:t>
+              <w:t xml:space="preserve">raw: ac ed 00 05 … 00 00 00 64 … → 0x64 = 100% (변조됨)</w:t>
             </w:r>
           </w:p>
         </w:tc>
@@ -7474,40 +7474,84 @@
         <w:tc>
           <w:tcPr>
             <w:tcW w:w="4500" w:type="dxa"/>
-            <w:tcMar>
-              <w:top w:w="40" w:type="dxa"/>
-              <w:left w:w="80" w:type="dxa"/>
-              <w:bottom w:w="40" w:type="dxa"/>
-              <w:right w:w="80" w:type="dxa"/>
-            </w:tcMar>
-          </w:tcPr>
-          <w:p>
-            <w:r>
-              <w:rPr>
-                <w:sz w:val="18"/>
-                <w:szCs w:val="18"/>
-              </w:rPr>
-              <w:t xml:space="preserve">expected == signature -&gt; isEqual 결과: true</w:t>
+            <w:shd w:val="clear" w:color="auto" w:fill="E2EFDA"/>
+            <w:tcMar>
+              <w:top w:w="40" w:type="dxa"/>
+              <w:left w:w="80" w:type="dxa"/>
+              <w:bottom w:w="40" w:type="dxa"/>
+              <w:right w:w="80" w:type="dxa"/>
+            </w:tcMar>
+          </w:tcPr>
+          <w:p>
+            <w:r>
+              <w:rPr>
+                <w:sz w:val="18"/>
+                <w:szCs w:val="18"/>
+              </w:rPr>
+              <w:t xml:space="preserve">expected: 7f 3a 9c 12 e4 05 b8 61 …</w:t>
+            </w:r>
+          </w:p>
+          <w:p>
+            <w:r>
+              <w:rPr>
+                <w:sz w:val="18"/>
+                <w:szCs w:val="18"/>
+              </w:rPr>
+              <w:t xml:space="preserve">signature: 7f 3a 9c 12 e4 05 b8 61 …</w:t>
+            </w:r>
+          </w:p>
+          <w:p>
+            <w:r>
+              <w:rPr>
+                <w:b/>
+                <w:bCs/>
+                <w:color w:val="375623"/>
+                <w:sz w:val="18"/>
+                <w:szCs w:val="18"/>
+              </w:rPr>
+              <w:t xml:space="preserve">isEqual 결과: true</w:t>
             </w:r>
           </w:p>
         </w:tc>
         <w:tc>
           <w:tcPr>
             <w:tcW w:w="4500" w:type="dxa"/>
-            <w:tcMar>
-              <w:top w:w="40" w:type="dxa"/>
-              <w:left w:w="80" w:type="dxa"/>
-              <w:bottom w:w="40" w:type="dxa"/>
-              <w:right w:w="80" w:type="dxa"/>
-            </w:tcMar>
-          </w:tcPr>
-          <w:p>
-            <w:r>
-              <w:rPr>
-                <w:sz w:val="18"/>
-                <w:szCs w:val="18"/>
-              </w:rPr>
-              <w:t xml:space="preserve">expected != signature -&gt; isEqual 결과: false</w:t>
+            <w:shd w:val="clear" w:color="auto" w:fill="FCE4E4"/>
+            <w:tcMar>
+              <w:top w:w="40" w:type="dxa"/>
+              <w:left w:w="80" w:type="dxa"/>
+              <w:bottom w:w="40" w:type="dxa"/>
+              <w:right w:w="80" w:type="dxa"/>
+            </w:tcMar>
+          </w:tcPr>
+          <w:p>
+            <w:r>
+              <w:rPr>
+                <w:sz w:val="18"/>
+                <w:szCs w:val="18"/>
+              </w:rPr>
+              <w:t xml:space="preserve">expected: c9 1e 44 a0 3b d7 02 8f …</w:t>
+            </w:r>
+          </w:p>
+          <w:p>
+            <w:r>
+              <w:rPr>
+                <w:sz w:val="18"/>
+                <w:szCs w:val="18"/>
+              </w:rPr>
+              <w:t xml:space="preserve">signature: 7f 3a 9c 12 e4 05 b8 61 …</w:t>
+            </w:r>
+          </w:p>
+          <w:p>
+            <w:r>
+              <w:rPr>
+                <w:b/>
+                <w:bCs/>
+                <w:color w:val="C00000"/>
+                <w:sz w:val="18"/>
+                <w:szCs w:val="18"/>
+              </w:rPr>
+              <w:t xml:space="preserve">isEqual 결과: false</w:t>
             </w:r>
           </w:p>
         </w:tc>
@@ -7646,40 +7690,66 @@
         <w:tc>
           <w:tcPr>
             <w:tcW w:w="4500" w:type="dxa"/>
-            <w:tcMar>
-              <w:top w:w="40" w:type="dxa"/>
-              <w:left w:w="80" w:type="dxa"/>
-              <w:bottom w:w="40" w:type="dxa"/>
-              <w:right w:w="80" w:type="dxa"/>
-            </w:tcMar>
-          </w:tcPr>
-          <w:p>
-            <w:r>
-              <w:rPr>
-                <w:sz w:val="18"/>
-                <w:szCs w:val="18"/>
-              </w:rPr>
-              <w:t xml:space="preserve">검증 통과 -&gt; Voucher 복원. code=VIP50, discountPercent=50 — 발급 당시 그대로임이 보장되므로 믿고 사용한다.</w:t>
+            <w:shd w:val="clear" w:color="auto" w:fill="E2EFDA"/>
+            <w:tcMar>
+              <w:top w:w="40" w:type="dxa"/>
+              <w:left w:w="80" w:type="dxa"/>
+              <w:bottom w:w="40" w:type="dxa"/>
+              <w:right w:w="80" w:type="dxa"/>
+            </w:tcMar>
+          </w:tcPr>
+          <w:p>
+            <w:r>
+              <w:rPr>
+                <w:b/>
+                <w:bCs/>
+                <w:color w:val="375623"/>
+                <w:sz w:val="18"/>
+                <w:szCs w:val="18"/>
+              </w:rPr>
+              <w:t xml:space="preserve">검증 통과 → Voucher 복원</w:t>
+            </w:r>
+          </w:p>
+          <w:p>
+            <w:r>
+              <w:rPr>
+                <w:sz w:val="18"/>
+                <w:szCs w:val="18"/>
+              </w:rPr>
+              <w:t xml:space="preserve">code=VIP50, discountPercent=50. 발급 당시 그대로임이 보장되므로 믿고 사용한다.</w:t>
             </w:r>
           </w:p>
         </w:tc>
         <w:tc>
           <w:tcPr>
             <w:tcW w:w="4500" w:type="dxa"/>
-            <w:tcMar>
-              <w:top w:w="40" w:type="dxa"/>
-              <w:left w:w="80" w:type="dxa"/>
-              <w:bottom w:w="40" w:type="dxa"/>
-              <w:right w:w="80" w:type="dxa"/>
-            </w:tcMar>
-          </w:tcPr>
-          <w:p>
-            <w:r>
-              <w:rPr>
-                <w:sz w:val="18"/>
-                <w:szCs w:val="18"/>
-              </w:rPr>
-              <w:t xml:space="preserve">예외 발생: "서명이 유효하지 않습니다". deserializeFromBytes(raw)는 실행되지 않는다 — 변조된 바이트는 ObjectInputStream 에 들어가지도 못한다.</w:t>
+            <w:shd w:val="clear" w:color="auto" w:fill="FCE4E4"/>
+            <w:tcMar>
+              <w:top w:w="40" w:type="dxa"/>
+              <w:left w:w="80" w:type="dxa"/>
+              <w:bottom w:w="40" w:type="dxa"/>
+              <w:right w:w="80" w:type="dxa"/>
+            </w:tcMar>
+          </w:tcPr>
+          <w:p>
+            <w:r>
+              <w:rPr>
+                <w:b/>
+                <w:bCs/>
+                <w:color w:val="C00000"/>
+                <w:sz w:val="18"/>
+                <w:szCs w:val="18"/>
+              </w:rPr>
+              <w:t xml:space="preserve">예외 발생: 서명이 유효하지 않습니다</w:t>
+            </w:r>
+          </w:p>
+          <w:p>
+            <w:r>
+              <w:rPr>
+                <w:sz w:val="18"/>
+                <w:szCs w:val="18"/>
+              </w:rPr>
+              <w:t xml:space="preserve">deserializeFromBytes(raw)는 실행되지 않는다. 변조된 바이트는 ObjectInputStream 에 들어가지도 못한다.</w:t>
             </w:r>
           </w:p>
         </w:tc>

</xml_diff>